<commit_message>
Updated Testing Matrix and Timeline
</commit_message>
<xml_diff>
--- a/Top-Down Timeline.docx
+++ b/Top-Down Timeline.docx
@@ -86,28 +86,172 @@
         <w:t>ed</w:t>
       </w:r>
     </w:p>
+    <w:p>
+      <w:r>
+        <w:t>Player Character</w:t>
+      </w:r>
+    </w:p>
+    <w:p>
+      <w:r>
+        <w:tab/>
+        <w:t>Movement finished</w:t>
+      </w:r>
+    </w:p>
+    <w:p>
+      <w:r>
+        <w:tab/>
+        <w:t>Attacks outlined and partially implemented</w:t>
+      </w:r>
+    </w:p>
+    <w:p>
+      <w:r>
+        <w:tab/>
+      </w:r>
+      <w:r>
+        <w:tab/>
+        <w:t>Ranged bow attack</w:t>
+      </w:r>
+    </w:p>
+    <w:p>
+      <w:r>
+        <w:tab/>
+      </w:r>
+      <w:r>
+        <w:tab/>
+        <w:t>Melee Sword attack</w:t>
+      </w:r>
+    </w:p>
+    <w:p>
+      <w:r>
+        <w:t>Level elements outlined</w:t>
+      </w:r>
+    </w:p>
+    <w:p>
+      <w:r>
+        <w:tab/>
+        <w:t>Basic Testing Map that shows each of the additional Elements</w:t>
+      </w:r>
+    </w:p>
     <w:p/>
-    <w:p>
-      <w:r>
-        <w:t>Core Player Character Finished</w:t>
-      </w:r>
-    </w:p>
-    <w:p>
-      <w:r>
-        <w:t>Level elements outlined</w:t>
-      </w:r>
-    </w:p>
+    <w:p/>
+    <w:p/>
     <w:p>
       <w:r>
         <w:t xml:space="preserve">Additional </w:t>
       </w:r>
       <w:r>
-        <w:t xml:space="preserve">Element </w:t>
-      </w:r>
-      <w:r>
-        <w:t>finished</w:t>
-      </w:r>
-    </w:p>
+        <w:t>Element</w:t>
+      </w:r>
+      <w:r>
+        <w:t>s</w:t>
+      </w:r>
+      <w:r>
+        <w:t xml:space="preserve"> </w:t>
+      </w:r>
+      <w:r>
+        <w:t>f</w:t>
+      </w:r>
+      <w:r>
+        <w:t>unctionality Finished</w:t>
+      </w:r>
+    </w:p>
+    <w:p>
+      <w:r>
+        <w:tab/>
+        <w:t>Stationary Enemies</w:t>
+      </w:r>
+    </w:p>
+    <w:p>
+      <w:r>
+        <w:tab/>
+      </w:r>
+      <w:r>
+        <w:tab/>
+        <w:t>Bow Enemy</w:t>
+      </w:r>
+    </w:p>
+    <w:p>
+      <w:r>
+        <w:tab/>
+      </w:r>
+      <w:r>
+        <w:tab/>
+        <w:t>Mortar Enemy</w:t>
+      </w:r>
+    </w:p>
+    <w:p>
+      <w:r>
+        <w:tab/>
+        <w:t>Player Power Ups</w:t>
+      </w:r>
+    </w:p>
+    <w:p>
+      <w:r>
+        <w:tab/>
+      </w:r>
+      <w:r>
+        <w:tab/>
+        <w:t>Health Boost</w:t>
+      </w:r>
+    </w:p>
+    <w:p>
+      <w:r>
+        <w:tab/>
+      </w:r>
+      <w:r>
+        <w:tab/>
+        <w:t>Temporary Invulnerability</w:t>
+      </w:r>
+    </w:p>
+    <w:p>
+      <w:r>
+        <w:tab/>
+        <w:t>Enemy Traps</w:t>
+      </w:r>
+    </w:p>
+    <w:p>
+      <w:r>
+        <w:tab/>
+      </w:r>
+      <w:r>
+        <w:tab/>
+        <w:t>Spike Trap</w:t>
+      </w:r>
+    </w:p>
+    <w:p>
+      <w:r>
+        <w:tab/>
+      </w:r>
+      <w:r>
+        <w:tab/>
+        <w:t>AOE Trap</w:t>
+      </w:r>
+    </w:p>
+    <w:p>
+      <w:r>
+        <w:tab/>
+        <w:t>Player Equipment</w:t>
+      </w:r>
+    </w:p>
+    <w:p>
+      <w:r>
+        <w:tab/>
+      </w:r>
+      <w:r>
+        <w:tab/>
+        <w:t>Bow upgrade</w:t>
+      </w:r>
+    </w:p>
+    <w:p>
+      <w:r>
+        <w:tab/>
+      </w:r>
+      <w:r>
+        <w:tab/>
+        <w:t>Sword Upgrade</w:t>
+      </w:r>
+    </w:p>
+    <w:p/>
     <w:p>
       <w:pPr>
         <w:pBdr>
@@ -139,7 +283,6 @@
         </w:pBdr>
       </w:pPr>
       <w:r>
-        <w:lastRenderedPageBreak/>
         <w:t>Module 6 Saturday</w:t>
       </w:r>
     </w:p>

</xml_diff>